<commit_message>
Adaptação do código para a tabela 3.2
Também reparado o ícone do app
</commit_message>
<xml_diff>
--- a/appdata/template_estilos.docx
+++ b/appdata/template_estilos.docx
@@ -1,12 +1,20 @@
 
 <file path=word/document.xml><?xml version="1.0" encoding="utf-8"?>
-<w:document xmlns:wpc="http://schemas.microsoft.com/office/word/2010/wordprocessingCanvas" xmlns:cx="http://schemas.microsoft.com/office/drawing/2014/chartex" xmlns:cx1="http://schemas.microsoft.com/office/drawing/2015/9/8/chartex" xmlns:cx2="http://schemas.microsoft.com/office/drawing/2015/10/21/chartex" xmlns:cx3="http://schemas.microsoft.com/office/drawing/2016/5/9/chartex" xmlns:cx4="http://schemas.microsoft.com/office/drawing/2016/5/10/chartex" xmlns:cx5="http://schemas.microsoft.com/office/drawing/2016/5/11/chartex" xmlns:cx6="http://schemas.microsoft.com/office/drawing/2016/5/12/chartex" xmlns:cx7="http://schemas.microsoft.com/office/drawing/2016/5/13/chartex" xmlns:cx8="http://schemas.microsoft.com/office/drawing/2016/5/14/chartex" xmlns:mc="http://schemas.openxmlformats.org/markup-compatibility/2006" xmlns:aink="http://schemas.microsoft.com/office/drawing/2016/ink" xmlns:am3d="http://schemas.microsoft.com/office/drawing/2017/model3d" xmlns:o="urn:schemas-microsoft-com:office:office" xmlns:oel="http://schemas.microsoft.com/office/2019/extlst" xmlns:r="http://schemas.openxmlformats.org/officeDocument/2006/relationships" xmlns:m="http://schemas.openxmlformats.org/officeDocument/2006/math" xmlns:v="urn:schemas-microsoft-com:vml" xmlns:wp14="http://schemas.microsoft.com/office/word/2010/wordprocessingDrawing" xmlns:wp="http://schemas.openxmlformats.org/drawingml/2006/wordprocessingDrawing" xmlns:w10="urn:schemas-microsoft-com:office:word" xmlns:w="http://schemas.openxmlformats.org/wordprocessingml/2006/main" xmlns:w14="http://schemas.microsoft.com/office/word/2010/wordml" xmlns:w15="http://schemas.microsoft.com/office/word/2012/wordml" xmlns:w16cex="http://schemas.microsoft.com/office/word/2018/wordml/cex" xmlns:w16cid="http://schemas.microsoft.com/office/word/2016/wordml/cid" xmlns:w16="http://schemas.microsoft.com/office/word/2018/wordml" xmlns:w16du="http://schemas.microsoft.com/office/word/2023/wordml/word16du" xmlns:w16sdtdh="http://schemas.microsoft.com/office/word/2020/wordml/sdtdatahash" xmlns:w16se="http://schemas.microsoft.com/office/word/2015/wordml/symex" xmlns:wpg="http://schemas.microsoft.com/office/word/2010/wordprocessingGroup" xmlns:wpi="http://schemas.microsoft.com/office/word/2010/wordprocessingInk" xmlns:wne="http://schemas.microsoft.com/office/word/2006/wordml" xmlns:wps="http://schemas.microsoft.com/office/word/2010/wordprocessingShape" mc:Ignorable="w14 w15 w16se w16cid w16 w16cex w16sdtdh w16du wp14">
+<w:document xmlns:wpc="http://schemas.microsoft.com/office/word/2010/wordprocessingCanvas" xmlns:cx="http://schemas.microsoft.com/office/drawing/2014/chartex" xmlns:cx1="http://schemas.microsoft.com/office/drawing/2015/9/8/chartex" xmlns:cx2="http://schemas.microsoft.com/office/drawing/2015/10/21/chartex" xmlns:cx3="http://schemas.microsoft.com/office/drawing/2016/5/9/chartex" xmlns:cx4="http://schemas.microsoft.com/office/drawing/2016/5/10/chartex" xmlns:cx5="http://schemas.microsoft.com/office/drawing/2016/5/11/chartex" xmlns:cx6="http://schemas.microsoft.com/office/drawing/2016/5/12/chartex" xmlns:cx7="http://schemas.microsoft.com/office/drawing/2016/5/13/chartex" xmlns:cx8="http://schemas.microsoft.com/office/drawing/2016/5/14/chartex" xmlns:mc="http://schemas.openxmlformats.org/markup-compatibility/2006" xmlns:aink="http://schemas.microsoft.com/office/drawing/2016/ink" xmlns:am3d="http://schemas.microsoft.com/office/drawing/2017/model3d" xmlns:o="urn:schemas-microsoft-com:office:office" xmlns:oel="http://schemas.microsoft.com/office/2019/extlst" xmlns:r="http://schemas.openxmlformats.org/officeDocument/2006/relationships" xmlns:m="http://schemas.openxmlformats.org/officeDocument/2006/math" xmlns:v="urn:schemas-microsoft-com:vml" xmlns:wp14="http://schemas.microsoft.com/office/word/2010/wordprocessingDrawing" xmlns:wp="http://schemas.openxmlformats.org/drawingml/2006/wordprocessingDrawing" xmlns:w10="urn:schemas-microsoft-com:office:word" xmlns:w="http://schemas.openxmlformats.org/wordprocessingml/2006/main" xmlns:w14="http://schemas.microsoft.com/office/word/2010/wordml" xmlns:w15="http://schemas.microsoft.com/office/word/2012/wordml" xmlns:w16cex="http://schemas.microsoft.com/office/word/2018/wordml/cex" xmlns:w16cid="http://schemas.microsoft.com/office/word/2016/wordml/cid" xmlns:w16="http://schemas.microsoft.com/office/word/2018/wordml" xmlns:w16sdtdh="http://schemas.microsoft.com/office/word/2020/wordml/sdtdatahash" xmlns:w16se="http://schemas.microsoft.com/office/word/2015/wordml/symex" xmlns:wpg="http://schemas.microsoft.com/office/word/2010/wordprocessingGroup" xmlns:wpi="http://schemas.microsoft.com/office/word/2010/wordprocessingInk" xmlns:wne="http://schemas.microsoft.com/office/word/2006/wordml" xmlns:wps="http://schemas.microsoft.com/office/word/2010/wordprocessingShape" mc:Ignorable="w14 w15 w16se w16cid w16 w16cex w16sdtdh wp14">
   <w:body>
     <w:p>
       <w:pPr>
         <w:pStyle w:val="Anotao"/>
+        <w:rPr>
+          <w:sz w:val="17"/>
+          <w:szCs w:val="17"/>
+        </w:rPr>
       </w:pPr>
       <w:r>
+        <w:rPr>
+          <w:sz w:val="17"/>
+          <w:szCs w:val="17"/>
+        </w:rPr>
         <w:t>Não exclua este arquivo. Ele é necessário para a execução da ferramenta.</w:t>
       </w:r>
     </w:p>
@@ -23,7 +31,7 @@
 </file>
 
 <file path=word/endnotes.xml><?xml version="1.0" encoding="utf-8"?>
-<w:endnotes xmlns:wpc="http://schemas.microsoft.com/office/word/2010/wordprocessingCanvas" xmlns:cx="http://schemas.microsoft.com/office/drawing/2014/chartex" xmlns:cx1="http://schemas.microsoft.com/office/drawing/2015/9/8/chartex" xmlns:cx2="http://schemas.microsoft.com/office/drawing/2015/10/21/chartex" xmlns:cx3="http://schemas.microsoft.com/office/drawing/2016/5/9/chartex" xmlns:cx4="http://schemas.microsoft.com/office/drawing/2016/5/10/chartex" xmlns:cx5="http://schemas.microsoft.com/office/drawing/2016/5/11/chartex" xmlns:cx6="http://schemas.microsoft.com/office/drawing/2016/5/12/chartex" xmlns:cx7="http://schemas.microsoft.com/office/drawing/2016/5/13/chartex" xmlns:cx8="http://schemas.microsoft.com/office/drawing/2016/5/14/chartex" xmlns:mc="http://schemas.openxmlformats.org/markup-compatibility/2006" xmlns:aink="http://schemas.microsoft.com/office/drawing/2016/ink" xmlns:am3d="http://schemas.microsoft.com/office/drawing/2017/model3d" xmlns:o="urn:schemas-microsoft-com:office:office" xmlns:oel="http://schemas.microsoft.com/office/2019/extlst" xmlns:r="http://schemas.openxmlformats.org/officeDocument/2006/relationships" xmlns:m="http://schemas.openxmlformats.org/officeDocument/2006/math" xmlns:v="urn:schemas-microsoft-com:vml" xmlns:wp14="http://schemas.microsoft.com/office/word/2010/wordprocessingDrawing" xmlns:wp="http://schemas.openxmlformats.org/drawingml/2006/wordprocessingDrawing" xmlns:w10="urn:schemas-microsoft-com:office:word" xmlns:w="http://schemas.openxmlformats.org/wordprocessingml/2006/main" xmlns:w14="http://schemas.microsoft.com/office/word/2010/wordml" xmlns:w15="http://schemas.microsoft.com/office/word/2012/wordml" xmlns:w16cex="http://schemas.microsoft.com/office/word/2018/wordml/cex" xmlns:w16cid="http://schemas.microsoft.com/office/word/2016/wordml/cid" xmlns:w16="http://schemas.microsoft.com/office/word/2018/wordml" xmlns:w16du="http://schemas.microsoft.com/office/word/2023/wordml/word16du" xmlns:w16sdtdh="http://schemas.microsoft.com/office/word/2020/wordml/sdtdatahash" xmlns:w16se="http://schemas.microsoft.com/office/word/2015/wordml/symex" xmlns:wpg="http://schemas.microsoft.com/office/word/2010/wordprocessingGroup" xmlns:wpi="http://schemas.microsoft.com/office/word/2010/wordprocessingInk" xmlns:wne="http://schemas.microsoft.com/office/word/2006/wordml" xmlns:wps="http://schemas.microsoft.com/office/word/2010/wordprocessingShape" mc:Ignorable="w14 w15 w16se w16cid w16 w16cex w16sdtdh w16du wp14">
+<w:endnotes xmlns:wpc="http://schemas.microsoft.com/office/word/2010/wordprocessingCanvas" xmlns:cx="http://schemas.microsoft.com/office/drawing/2014/chartex" xmlns:cx1="http://schemas.microsoft.com/office/drawing/2015/9/8/chartex" xmlns:cx2="http://schemas.microsoft.com/office/drawing/2015/10/21/chartex" xmlns:cx3="http://schemas.microsoft.com/office/drawing/2016/5/9/chartex" xmlns:cx4="http://schemas.microsoft.com/office/drawing/2016/5/10/chartex" xmlns:cx5="http://schemas.microsoft.com/office/drawing/2016/5/11/chartex" xmlns:cx6="http://schemas.microsoft.com/office/drawing/2016/5/12/chartex" xmlns:cx7="http://schemas.microsoft.com/office/drawing/2016/5/13/chartex" xmlns:cx8="http://schemas.microsoft.com/office/drawing/2016/5/14/chartex" xmlns:mc="http://schemas.openxmlformats.org/markup-compatibility/2006" xmlns:aink="http://schemas.microsoft.com/office/drawing/2016/ink" xmlns:am3d="http://schemas.microsoft.com/office/drawing/2017/model3d" xmlns:o="urn:schemas-microsoft-com:office:office" xmlns:oel="http://schemas.microsoft.com/office/2019/extlst" xmlns:r="http://schemas.openxmlformats.org/officeDocument/2006/relationships" xmlns:m="http://schemas.openxmlformats.org/officeDocument/2006/math" xmlns:v="urn:schemas-microsoft-com:vml" xmlns:wp14="http://schemas.microsoft.com/office/word/2010/wordprocessingDrawing" xmlns:wp="http://schemas.openxmlformats.org/drawingml/2006/wordprocessingDrawing" xmlns:w10="urn:schemas-microsoft-com:office:word" xmlns:w="http://schemas.openxmlformats.org/wordprocessingml/2006/main" xmlns:w14="http://schemas.microsoft.com/office/word/2010/wordml" xmlns:w15="http://schemas.microsoft.com/office/word/2012/wordml" xmlns:w16cex="http://schemas.microsoft.com/office/word/2018/wordml/cex" xmlns:w16cid="http://schemas.microsoft.com/office/word/2016/wordml/cid" xmlns:w16="http://schemas.microsoft.com/office/word/2018/wordml" xmlns:w16sdtdh="http://schemas.microsoft.com/office/word/2020/wordml/sdtdatahash" xmlns:w16se="http://schemas.microsoft.com/office/word/2015/wordml/symex" xmlns:wpg="http://schemas.microsoft.com/office/word/2010/wordprocessingGroup" xmlns:wpi="http://schemas.microsoft.com/office/word/2010/wordprocessingInk" xmlns:wne="http://schemas.microsoft.com/office/word/2006/wordml" xmlns:wps="http://schemas.microsoft.com/office/word/2010/wordprocessingShape" mc:Ignorable="w14 w15 w16se w16cid w16 w16cex w16sdtdh wp14">
   <w:endnote w:type="separator" w:id="-1">
     <w:p>
       <w:pPr>
@@ -48,7 +56,7 @@
 </file>
 
 <file path=word/footer1.xml><?xml version="1.0" encoding="utf-8"?>
-<w:ftr xmlns:wpc="http://schemas.microsoft.com/office/word/2010/wordprocessingCanvas" xmlns:cx="http://schemas.microsoft.com/office/drawing/2014/chartex" xmlns:cx1="http://schemas.microsoft.com/office/drawing/2015/9/8/chartex" xmlns:cx2="http://schemas.microsoft.com/office/drawing/2015/10/21/chartex" xmlns:cx3="http://schemas.microsoft.com/office/drawing/2016/5/9/chartex" xmlns:cx4="http://schemas.microsoft.com/office/drawing/2016/5/10/chartex" xmlns:cx5="http://schemas.microsoft.com/office/drawing/2016/5/11/chartex" xmlns:cx6="http://schemas.microsoft.com/office/drawing/2016/5/12/chartex" xmlns:cx7="http://schemas.microsoft.com/office/drawing/2016/5/13/chartex" xmlns:cx8="http://schemas.microsoft.com/office/drawing/2016/5/14/chartex" xmlns:mc="http://schemas.openxmlformats.org/markup-compatibility/2006" xmlns:aink="http://schemas.microsoft.com/office/drawing/2016/ink" xmlns:am3d="http://schemas.microsoft.com/office/drawing/2017/model3d" xmlns:o="urn:schemas-microsoft-com:office:office" xmlns:oel="http://schemas.microsoft.com/office/2019/extlst" xmlns:r="http://schemas.openxmlformats.org/officeDocument/2006/relationships" xmlns:m="http://schemas.openxmlformats.org/officeDocument/2006/math" xmlns:v="urn:schemas-microsoft-com:vml" xmlns:wp14="http://schemas.microsoft.com/office/word/2010/wordprocessingDrawing" xmlns:wp="http://schemas.openxmlformats.org/drawingml/2006/wordprocessingDrawing" xmlns:w10="urn:schemas-microsoft-com:office:word" xmlns:w="http://schemas.openxmlformats.org/wordprocessingml/2006/main" xmlns:w14="http://schemas.microsoft.com/office/word/2010/wordml" xmlns:w15="http://schemas.microsoft.com/office/word/2012/wordml" xmlns:w16cex="http://schemas.microsoft.com/office/word/2018/wordml/cex" xmlns:w16cid="http://schemas.microsoft.com/office/word/2016/wordml/cid" xmlns:w16="http://schemas.microsoft.com/office/word/2018/wordml" xmlns:w16du="http://schemas.microsoft.com/office/word/2023/wordml/word16du" xmlns:w16sdtdh="http://schemas.microsoft.com/office/word/2020/wordml/sdtdatahash" xmlns:w16se="http://schemas.microsoft.com/office/word/2015/wordml/symex" xmlns:wpg="http://schemas.microsoft.com/office/word/2010/wordprocessingGroup" xmlns:wpi="http://schemas.microsoft.com/office/word/2010/wordprocessingInk" xmlns:wne="http://schemas.microsoft.com/office/word/2006/wordml" xmlns:wps="http://schemas.microsoft.com/office/word/2010/wordprocessingShape" mc:Ignorable="w14 w15 w16se w16cid w16 w16cex w16sdtdh w16du wp14">
+<w:ftr xmlns:wpc="http://schemas.microsoft.com/office/word/2010/wordprocessingCanvas" xmlns:cx="http://schemas.microsoft.com/office/drawing/2014/chartex" xmlns:cx1="http://schemas.microsoft.com/office/drawing/2015/9/8/chartex" xmlns:cx2="http://schemas.microsoft.com/office/drawing/2015/10/21/chartex" xmlns:cx3="http://schemas.microsoft.com/office/drawing/2016/5/9/chartex" xmlns:cx4="http://schemas.microsoft.com/office/drawing/2016/5/10/chartex" xmlns:cx5="http://schemas.microsoft.com/office/drawing/2016/5/11/chartex" xmlns:cx6="http://schemas.microsoft.com/office/drawing/2016/5/12/chartex" xmlns:cx7="http://schemas.microsoft.com/office/drawing/2016/5/13/chartex" xmlns:cx8="http://schemas.microsoft.com/office/drawing/2016/5/14/chartex" xmlns:mc="http://schemas.openxmlformats.org/markup-compatibility/2006" xmlns:aink="http://schemas.microsoft.com/office/drawing/2016/ink" xmlns:am3d="http://schemas.microsoft.com/office/drawing/2017/model3d" xmlns:o="urn:schemas-microsoft-com:office:office" xmlns:oel="http://schemas.microsoft.com/office/2019/extlst" xmlns:r="http://schemas.openxmlformats.org/officeDocument/2006/relationships" xmlns:m="http://schemas.openxmlformats.org/officeDocument/2006/math" xmlns:v="urn:schemas-microsoft-com:vml" xmlns:wp14="http://schemas.microsoft.com/office/word/2010/wordprocessingDrawing" xmlns:wp="http://schemas.openxmlformats.org/drawingml/2006/wordprocessingDrawing" xmlns:w10="urn:schemas-microsoft-com:office:word" xmlns:w="http://schemas.openxmlformats.org/wordprocessingml/2006/main" xmlns:w14="http://schemas.microsoft.com/office/word/2010/wordml" xmlns:w15="http://schemas.microsoft.com/office/word/2012/wordml" xmlns:w16cex="http://schemas.microsoft.com/office/word/2018/wordml/cex" xmlns:w16cid="http://schemas.microsoft.com/office/word/2016/wordml/cid" xmlns:w16="http://schemas.microsoft.com/office/word/2018/wordml" xmlns:w16sdtdh="http://schemas.microsoft.com/office/word/2020/wordml/sdtdatahash" xmlns:w16se="http://schemas.microsoft.com/office/word/2015/wordml/symex" xmlns:wpg="http://schemas.microsoft.com/office/word/2010/wordprocessingGroup" xmlns:wpi="http://schemas.microsoft.com/office/word/2010/wordprocessingInk" xmlns:wne="http://schemas.microsoft.com/office/word/2006/wordml" xmlns:wps="http://schemas.microsoft.com/office/word/2010/wordprocessingShape" mc:Ignorable="w14 w15 w16se w16cid w16 w16cex w16sdtdh wp14">
   <w:sdt>
     <w:sdtPr>
       <w:id w:val="1242217331"/>
@@ -90,7 +98,7 @@
 </file>
 
 <file path=word/footnotes.xml><?xml version="1.0" encoding="utf-8"?>
-<w:footnotes xmlns:wpc="http://schemas.microsoft.com/office/word/2010/wordprocessingCanvas" xmlns:cx="http://schemas.microsoft.com/office/drawing/2014/chartex" xmlns:cx1="http://schemas.microsoft.com/office/drawing/2015/9/8/chartex" xmlns:cx2="http://schemas.microsoft.com/office/drawing/2015/10/21/chartex" xmlns:cx3="http://schemas.microsoft.com/office/drawing/2016/5/9/chartex" xmlns:cx4="http://schemas.microsoft.com/office/drawing/2016/5/10/chartex" xmlns:cx5="http://schemas.microsoft.com/office/drawing/2016/5/11/chartex" xmlns:cx6="http://schemas.microsoft.com/office/drawing/2016/5/12/chartex" xmlns:cx7="http://schemas.microsoft.com/office/drawing/2016/5/13/chartex" xmlns:cx8="http://schemas.microsoft.com/office/drawing/2016/5/14/chartex" xmlns:mc="http://schemas.openxmlformats.org/markup-compatibility/2006" xmlns:aink="http://schemas.microsoft.com/office/drawing/2016/ink" xmlns:am3d="http://schemas.microsoft.com/office/drawing/2017/model3d" xmlns:o="urn:schemas-microsoft-com:office:office" xmlns:oel="http://schemas.microsoft.com/office/2019/extlst" xmlns:r="http://schemas.openxmlformats.org/officeDocument/2006/relationships" xmlns:m="http://schemas.openxmlformats.org/officeDocument/2006/math" xmlns:v="urn:schemas-microsoft-com:vml" xmlns:wp14="http://schemas.microsoft.com/office/word/2010/wordprocessingDrawing" xmlns:wp="http://schemas.openxmlformats.org/drawingml/2006/wordprocessingDrawing" xmlns:w10="urn:schemas-microsoft-com:office:word" xmlns:w="http://schemas.openxmlformats.org/wordprocessingml/2006/main" xmlns:w14="http://schemas.microsoft.com/office/word/2010/wordml" xmlns:w15="http://schemas.microsoft.com/office/word/2012/wordml" xmlns:w16cex="http://schemas.microsoft.com/office/word/2018/wordml/cex" xmlns:w16cid="http://schemas.microsoft.com/office/word/2016/wordml/cid" xmlns:w16="http://schemas.microsoft.com/office/word/2018/wordml" xmlns:w16du="http://schemas.microsoft.com/office/word/2023/wordml/word16du" xmlns:w16sdtdh="http://schemas.microsoft.com/office/word/2020/wordml/sdtdatahash" xmlns:w16se="http://schemas.microsoft.com/office/word/2015/wordml/symex" xmlns:wpg="http://schemas.microsoft.com/office/word/2010/wordprocessingGroup" xmlns:wpi="http://schemas.microsoft.com/office/word/2010/wordprocessingInk" xmlns:wne="http://schemas.microsoft.com/office/word/2006/wordml" xmlns:wps="http://schemas.microsoft.com/office/word/2010/wordprocessingShape" mc:Ignorable="w14 w15 w16se w16cid w16 w16cex w16sdtdh w16du wp14">
+<w:footnotes xmlns:wpc="http://schemas.microsoft.com/office/word/2010/wordprocessingCanvas" xmlns:cx="http://schemas.microsoft.com/office/drawing/2014/chartex" xmlns:cx1="http://schemas.microsoft.com/office/drawing/2015/9/8/chartex" xmlns:cx2="http://schemas.microsoft.com/office/drawing/2015/10/21/chartex" xmlns:cx3="http://schemas.microsoft.com/office/drawing/2016/5/9/chartex" xmlns:cx4="http://schemas.microsoft.com/office/drawing/2016/5/10/chartex" xmlns:cx5="http://schemas.microsoft.com/office/drawing/2016/5/11/chartex" xmlns:cx6="http://schemas.microsoft.com/office/drawing/2016/5/12/chartex" xmlns:cx7="http://schemas.microsoft.com/office/drawing/2016/5/13/chartex" xmlns:cx8="http://schemas.microsoft.com/office/drawing/2016/5/14/chartex" xmlns:mc="http://schemas.openxmlformats.org/markup-compatibility/2006" xmlns:aink="http://schemas.microsoft.com/office/drawing/2016/ink" xmlns:am3d="http://schemas.microsoft.com/office/drawing/2017/model3d" xmlns:o="urn:schemas-microsoft-com:office:office" xmlns:oel="http://schemas.microsoft.com/office/2019/extlst" xmlns:r="http://schemas.openxmlformats.org/officeDocument/2006/relationships" xmlns:m="http://schemas.openxmlformats.org/officeDocument/2006/math" xmlns:v="urn:schemas-microsoft-com:vml" xmlns:wp14="http://schemas.microsoft.com/office/word/2010/wordprocessingDrawing" xmlns:wp="http://schemas.openxmlformats.org/drawingml/2006/wordprocessingDrawing" xmlns:w10="urn:schemas-microsoft-com:office:word" xmlns:w="http://schemas.openxmlformats.org/wordprocessingml/2006/main" xmlns:w14="http://schemas.microsoft.com/office/word/2010/wordml" xmlns:w15="http://schemas.microsoft.com/office/word/2012/wordml" xmlns:w16cex="http://schemas.microsoft.com/office/word/2018/wordml/cex" xmlns:w16cid="http://schemas.microsoft.com/office/word/2016/wordml/cid" xmlns:w16="http://schemas.microsoft.com/office/word/2018/wordml" xmlns:w16sdtdh="http://schemas.microsoft.com/office/word/2020/wordml/sdtdatahash" xmlns:w16se="http://schemas.microsoft.com/office/word/2015/wordml/symex" xmlns:wpg="http://schemas.microsoft.com/office/word/2010/wordprocessingGroup" xmlns:wpi="http://schemas.microsoft.com/office/word/2010/wordprocessingInk" xmlns:wne="http://schemas.microsoft.com/office/word/2006/wordml" xmlns:wps="http://schemas.microsoft.com/office/word/2010/wordprocessingShape" mc:Ignorable="w14 w15 w16se w16cid w16 w16cex w16sdtdh wp14">
   <w:footnote w:type="separator" w:id="-1">
     <w:p>
       <w:pPr>
@@ -115,7 +123,7 @@
 </file>
 
 <file path=word/styles.xml><?xml version="1.0" encoding="utf-8"?>
-<w:styles xmlns:mc="http://schemas.openxmlformats.org/markup-compatibility/2006" xmlns:r="http://schemas.openxmlformats.org/officeDocument/2006/relationships" xmlns:w="http://schemas.openxmlformats.org/wordprocessingml/2006/main" xmlns:w14="http://schemas.microsoft.com/office/word/2010/wordml" xmlns:w15="http://schemas.microsoft.com/office/word/2012/wordml" xmlns:w16cex="http://schemas.microsoft.com/office/word/2018/wordml/cex" xmlns:w16cid="http://schemas.microsoft.com/office/word/2016/wordml/cid" xmlns:w16="http://schemas.microsoft.com/office/word/2018/wordml" xmlns:w16du="http://schemas.microsoft.com/office/word/2023/wordml/word16du" xmlns:w16sdtdh="http://schemas.microsoft.com/office/word/2020/wordml/sdtdatahash" xmlns:w16se="http://schemas.microsoft.com/office/word/2015/wordml/symex" mc:Ignorable="w14 w15 w16se w16cid w16 w16cex w16sdtdh w16du">
+<w:styles xmlns:mc="http://schemas.openxmlformats.org/markup-compatibility/2006" xmlns:r="http://schemas.openxmlformats.org/officeDocument/2006/relationships" xmlns:w="http://schemas.openxmlformats.org/wordprocessingml/2006/main" xmlns:w14="http://schemas.microsoft.com/office/word/2010/wordml" xmlns:w15="http://schemas.microsoft.com/office/word/2012/wordml" xmlns:w16cex="http://schemas.microsoft.com/office/word/2018/wordml/cex" xmlns:w16cid="http://schemas.microsoft.com/office/word/2016/wordml/cid" xmlns:w16="http://schemas.microsoft.com/office/word/2018/wordml" xmlns:w16sdtdh="http://schemas.microsoft.com/office/word/2020/wordml/sdtdatahash" xmlns:w16se="http://schemas.microsoft.com/office/word/2015/wordml/symex" mc:Ignorable="w14 w15 w16se w16cid w16 w16cex w16sdtdh">
   <w:docDefaults>
     <w:rPrDefault>
       <w:rPr>
@@ -892,22 +900,25 @@
     <w:next w:val="Normal"/>
     <w:link w:val="AnotaoChar"/>
     <w:qFormat/>
-    <w:rsid w:val="00050806"/>
+    <w:rsid w:val="00557224"/>
     <w:rPr>
       <w:i/>
       <w:color w:val="FF0000"/>
+      <w:sz w:val="16"/>
+      <w:szCs w:val="16"/>
     </w:rPr>
   </w:style>
   <w:style w:type="character" w:customStyle="1" w:styleId="AnotaoChar">
     <w:name w:val="Anotação Char"/>
     <w:basedOn w:val="Fontepargpadro"/>
     <w:link w:val="Anotao"/>
-    <w:rsid w:val="00050806"/>
+    <w:rsid w:val="00557224"/>
     <w:rPr>
       <w:rFonts w:ascii="Calibri" w:hAnsi="Calibri"/>
       <w:i/>
       <w:color w:val="FF0000"/>
-      <w:sz w:val="21"/>
+      <w:sz w:val="16"/>
+      <w:szCs w:val="16"/>
     </w:rPr>
   </w:style>
   <w:style w:type="paragraph" w:styleId="SemEspaamento">

</xml_diff>